<commit_message>
Added API Endpoints and Tested using Postman
</commit_message>
<xml_diff>
--- a/Documentation/1.1 Download Software.docx
+++ b/Documentation/1.1 Download Software.docx
@@ -139,11 +139,6 @@
       </w:pPr>
     </w:p>
     <w:p>
-      <w:pPr>
-        <w:rPr>
-          <w:lang w:val="en-US"/>
-        </w:rPr>
-      </w:pPr>
       <w:r>
         <w:rPr>
           <w:lang w:val="en-US"/>
@@ -171,6 +166,29 @@
           <w:t>https://git-scm.com/</w:t>
         </w:r>
       </w:hyperlink>
+    </w:p>
+    <w:p/>
+    <w:p>
+      <w:r>
+        <w:t>5. Postman:</w:t>
+      </w:r>
+    </w:p>
+    <w:p>
+      <w:hyperlink r:id="rId8" w:history="1">
+        <w:r>
+          <w:rPr>
+            <w:rStyle w:val="Hyperlink"/>
+          </w:rPr>
+          <w:t>https://www.postman.com/downloads/</w:t>
+        </w:r>
+      </w:hyperlink>
+    </w:p>
+    <w:p>
+      <w:pPr>
+        <w:rPr>
+          <w:lang w:val="en-US"/>
+        </w:rPr>
+      </w:pPr>
     </w:p>
     <w:p>
       <w:pPr>
@@ -792,7 +810,6 @@
   <w:style w:type="character" w:default="1" w:styleId="DefaultParagraphFont">
     <w:name w:val="Default Paragraph Font"/>
     <w:uiPriority w:val="1"/>
-    <w:semiHidden/>
     <w:unhideWhenUsed/>
   </w:style>
   <w:style w:type="table" w:default="1" w:styleId="TableNormal">

</xml_diff>

<commit_message>
Created front end for adding new clients and searching
</commit_message>
<xml_diff>
--- a/Documentation/1.1 Download Software.docx
+++ b/Documentation/1.1 Download Software.docx
@@ -183,6 +183,27 @@
         </w:r>
       </w:hyperlink>
     </w:p>
+    <w:p/>
+    <w:p>
+      <w:r>
+        <w:t>6. Node.js (React.js):</w:t>
+      </w:r>
+      <w:r>
+        <w:br/>
+      </w:r>
+      <w:r>
+        <w:br/>
+      </w:r>
+      <w:hyperlink r:id="rId9" w:history="1">
+        <w:r>
+          <w:rPr>
+            <w:rStyle w:val="Hyperlink"/>
+          </w:rPr>
+          <w:t>https://nodejs.org/</w:t>
+        </w:r>
+      </w:hyperlink>
+    </w:p>
+    <w:p/>
     <w:p>
       <w:pPr>
         <w:rPr>

</xml_diff>